<commit_message>
Pre-launch relabel: honest pre-launch presentation (release-gate fix)
</commit_message>
<xml_diff>
--- a/site/dist/paperwork/paperwork-certificate-policy.docx
+++ b/site/dist/paperwork/paperwork-certificate-policy.docx
@@ -27,6 +27,22 @@
           <w:b/>
           <w:color w:val="B98A2F"/>
         </w:rPr>
+        <w:t>Pre-launch status:</w:t>
+      </w:r>
+      <w:r>
+        <w:rPr>
+          <w:b/>
+          <w:color w:val="B98A2F"/>
+        </w:rPr>
+        <w:t xml:space="preserve"> AxiomCode has not yet opened. These documents take effect when the service opens for submissions and payments; no certificates have been publicly issued under them yet.</w:t>
+      </w:r>
+    </w:p>
+    <w:p>
+      <w:r>
+        <w:rPr>
+          <w:b/>
+          <w:color w:val="B98A2F"/>
+        </w:rPr>
         <w:t>These documents govern the AxiomCode service. They are written in plain language and describe process and outcomes, not marketing claims. Material liability and warranty terms should be reviewed by qualified legal counsel before they are relied upon in any dispute.</w:t>
       </w:r>
     </w:p>
@@ -48,6 +64,11 @@
           <w:sz w:val="24"/>
         </w:rPr>
         <w:t>Last updated: 26 September 2026</w:t>
+      </w:r>
+    </w:p>
+    <w:p>
+      <w:r>
+        <w:t>Download as Word (.docx) (/paperwork/paperwork-certificate-policy.docx)</w:t>
       </w:r>
     </w:p>
     <w:p>
@@ -113,13 +134,13 @@
         <w:t>1.4 Certificate usage.</w:t>
       </w:r>
       <w:r>
-        <w:t xml:space="preserve"> Certificates assert: </w:t>
+        <w:t xml:space="preserve"> Each certificate credentials the code submitted: it is our assessment that the artifact with the stated hash was built to its specification, as mechanically checked by the stated toolchain on the stated date. </w:t>
       </w:r>
       <w:r>
         <w:rPr>
-          <w:i/>
+          <w:b/>
         </w:rPr>
-        <w:t>on the stated date, the AxiomCode engine compiled the artifact with the stated hash under the stated toolchain, and the proof checked.</w:t>
+        <w:t>We hold no responsibility beyond this assessment.</w:t>
       </w:r>
       <w:r>
         <w:t xml:space="preserve"> Appropriate uses: audit evidence, procurement deliverables, counterparty assurance. Prohibited reliance: treating a certificate as a warranty of safety, fitness, or intent — see §9.</w:t>
@@ -306,13 +327,22 @@
     </w:p>
     <w:p>
       <w:r>
-        <w:t xml:space="preserve">Certificates are factual statements about a verification event, not warranties. Liability is limited as stated in the </w:t>
+        <w:t xml:space="preserve">Certificates credential the code submitted and nothing more; they are factual statements about a verification event, not warranties. </w:t>
+      </w:r>
+      <w:r>
+        <w:rPr>
+          <w:b/>
+        </w:rPr>
+        <w:t>We hold no responsibility beyond the assessment stated in the certificate.</w:t>
+      </w:r>
+      <w:r>
+        <w:t xml:space="preserve"> Liability is limited as stated in the </w:t>
       </w:r>
       <w:r>
         <w:t>Terms of Service (/paperwork/terms/)</w:t>
       </w:r>
       <w:r>
-        <w:t>. Subscribers warrant they have the right to submit the artifact. Relying parties must validate certificates through the published checker and revocation list; reliance on an expired or revoked certificate is at the relying party’s own risk.</w:t>
+        <w:t xml:space="preserve"> (per-certificate cap at the verification fee; aggregate cap at 12 months’ fees; no consequential damages; no duty to relying parties beyond this Policy). Subscribers warrant they have the right to submit the artifact. Relying parties must validate certificates through the published checker and revocation list before relying; any reliance is at the relying party’s own risk.</w:t>
       </w:r>
     </w:p>
     <w:sectPr>

</xml_diff>